<commit_message>
modified files and deleted temp files
</commit_message>
<xml_diff>
--- a/Onboarding_App_User_Manual.docx
+++ b/Onboarding_App_User_Manual.docx
@@ -230,6 +230,7 @@
       <w:r>
         <w:rPr>
           <w:i/>
+          <w:noProof/>
         </w:rPr>
         <w:drawing>
           <wp:inline distT="0" distB="0" distL="0" distR="0" wp14:anchorId="07F05505" wp14:editId="29FA42FC">
@@ -367,6 +368,9 @@
         <w:ind w:left="1440" w:firstLine="720"/>
       </w:pPr>
       <w:r>
+        <w:rPr>
+          <w:noProof/>
+        </w:rPr>
         <w:drawing>
           <wp:inline distT="0" distB="0" distL="0" distR="0" wp14:anchorId="6A5CA348" wp14:editId="7EF10028">
             <wp:extent cx="4419983" cy="5349704"/>
@@ -549,6 +553,9 @@
     <w:p/>
     <w:p>
       <w:r>
+        <w:rPr>
+          <w:noProof/>
+        </w:rPr>
         <w:drawing>
           <wp:inline distT="0" distB="0" distL="0" distR="0" wp14:anchorId="45717119" wp14:editId="48F162B3">
             <wp:extent cx="6858000" cy="3891915"/>
@@ -728,11 +735,12 @@
       <w:r>
         <w:rPr>
           <w:i/>
+          <w:noProof/>
         </w:rPr>
         <w:drawing>
-          <wp:inline distT="0" distB="0" distL="0" distR="0" wp14:anchorId="23D2870D" wp14:editId="0AFF0DA8">
-            <wp:extent cx="6858000" cy="3997325"/>
-            <wp:effectExtent l="0" t="0" r="0" b="3175"/>
+          <wp:inline distT="0" distB="0" distL="0" distR="0" wp14:anchorId="23D2870D" wp14:editId="6965F538">
+            <wp:extent cx="6858000" cy="3887631"/>
+            <wp:effectExtent l="0" t="0" r="0" b="0"/>
             <wp:docPr id="631766041" name="Picture 1"/>
             <wp:cNvGraphicFramePr>
               <a:graphicFrameLocks xmlns:a="http://schemas.openxmlformats.org/drawingml/2006/main" noChangeAspect="1"/>
@@ -741,7 +749,7 @@
               <a:graphicData uri="http://schemas.openxmlformats.org/drawingml/2006/picture">
                 <pic:pic xmlns:pic="http://schemas.openxmlformats.org/drawingml/2006/picture">
                   <pic:nvPicPr>
-                    <pic:cNvPr id="631766041" name=""/>
+                    <pic:cNvPr id="631766041" name="Picture 1"/>
                     <pic:cNvPicPr/>
                   </pic:nvPicPr>
                   <pic:blipFill>
@@ -753,7 +761,7 @@
                   <pic:spPr>
                     <a:xfrm>
                       <a:off x="0" y="0"/>
-                      <a:ext cx="6858000" cy="3997325"/>
+                      <a:ext cx="6858000" cy="3887631"/>
                     </a:xfrm>
                     <a:prstGeom prst="rect">
                       <a:avLst/>
@@ -776,6 +784,7 @@
           <w:b w:val="0"/>
           <w:bCs w:val="0"/>
           <w:i/>
+          <w:noProof/>
           <w:color w:val="auto"/>
         </w:rPr>
         <w:lastRenderedPageBreak/>
@@ -841,19 +850,8 @@
         <w:rPr>
           <w:b/>
         </w:rPr>
-        <w:t xml:space="preserve">Available </w:t>
-      </w:r>
-      <w:proofErr w:type="gramStart"/>
-      <w:r>
-        <w:rPr>
-          <w:b/>
-        </w:rPr>
-        <w:t>Features:</w:t>
-      </w:r>
-      <w:r>
-        <w:t>-</w:t>
-      </w:r>
-      <w:proofErr w:type="gramEnd"/>
+        <w:t>Available Features:</w:t>
+      </w:r>
     </w:p>
     <w:p>
       <w:pPr>
@@ -949,6 +947,7 @@
       <w:r>
         <w:rPr>
           <w:i/>
+          <w:noProof/>
         </w:rPr>
         <w:lastRenderedPageBreak/>
         <w:drawing>
@@ -990,6 +989,9 @@
     </w:p>
     <w:p>
       <w:r>
+        <w:rPr>
+          <w:noProof/>
+        </w:rPr>
         <w:lastRenderedPageBreak/>
         <w:drawing>
           <wp:inline distT="0" distB="0" distL="0" distR="0" wp14:anchorId="47712381" wp14:editId="1A90D8BF">
@@ -1155,6 +1157,7 @@
           <w:b w:val="0"/>
           <w:bCs w:val="0"/>
           <w:i/>
+          <w:noProof/>
           <w:color w:val="auto"/>
         </w:rPr>
         <w:lastRenderedPageBreak/>
@@ -1200,6 +1203,9 @@
         <w:ind w:firstLine="720"/>
       </w:pPr>
       <w:r>
+        <w:rPr>
+          <w:noProof/>
+        </w:rPr>
         <w:lastRenderedPageBreak/>
         <w:drawing>
           <wp:inline distT="0" distB="0" distL="0" distR="0" wp14:anchorId="10FEA93A" wp14:editId="5F884B1E">
@@ -1240,6 +1246,11 @@
     </w:p>
     <w:p>
       <w:pPr>
+        <w:ind w:firstLine="720"/>
+      </w:pPr>
+    </w:p>
+    <w:p>
+      <w:pPr>
         <w:pStyle w:val="Heading3"/>
       </w:pPr>
       <w:r>
@@ -1360,6 +1371,9 @@
         <w:pStyle w:val="Heading3"/>
       </w:pPr>
       <w:r>
+        <w:rPr>
+          <w:noProof/>
+        </w:rPr>
         <w:lastRenderedPageBreak/>
         <w:drawing>
           <wp:inline distT="0" distB="0" distL="0" distR="0" wp14:anchorId="22725B27" wp14:editId="138CF423">
@@ -1400,6 +1414,9 @@
     </w:p>
     <w:p>
       <w:r>
+        <w:rPr>
+          <w:noProof/>
+        </w:rPr>
         <w:lastRenderedPageBreak/>
         <w:drawing>
           <wp:inline distT="0" distB="0" distL="0" distR="0" wp14:anchorId="7B595633" wp14:editId="4B84B662">
@@ -1582,6 +1599,7 @@
       <w:r>
         <w:rPr>
           <w:i/>
+          <w:noProof/>
         </w:rPr>
         <w:drawing>
           <wp:inline distT="0" distB="0" distL="0" distR="0" wp14:anchorId="3E5A5F7F" wp14:editId="593B5185">
@@ -1630,6 +1648,9 @@
         <w:pStyle w:val="Heading3"/>
       </w:pPr>
       <w:r>
+        <w:rPr>
+          <w:noProof/>
+        </w:rPr>
         <w:drawing>
           <wp:inline distT="0" distB="0" distL="0" distR="0" wp14:anchorId="703985D0" wp14:editId="62BC1AA8">
             <wp:extent cx="6858000" cy="7291070"/>
@@ -1826,12 +1847,12 @@
       <w:r>
         <w:rPr>
           <w:i/>
+          <w:noProof/>
         </w:rPr>
-        <w:lastRenderedPageBreak/>
         <w:drawing>
-          <wp:inline distT="0" distB="0" distL="0" distR="0" wp14:anchorId="6B7C10DC" wp14:editId="119FBD6A">
-            <wp:extent cx="6858000" cy="3842385"/>
-            <wp:effectExtent l="0" t="0" r="0" b="5715"/>
+          <wp:inline distT="0" distB="0" distL="0" distR="0" wp14:anchorId="6B7C10DC" wp14:editId="55B48174">
+            <wp:extent cx="6858000" cy="2632193"/>
+            <wp:effectExtent l="0" t="0" r="0" b="0"/>
             <wp:docPr id="949030391" name="Picture 1"/>
             <wp:cNvGraphicFramePr>
               <a:graphicFrameLocks xmlns:a="http://schemas.openxmlformats.org/drawingml/2006/main" noChangeAspect="1"/>
@@ -1840,7 +1861,7 @@
               <a:graphicData uri="http://schemas.openxmlformats.org/drawingml/2006/picture">
                 <pic:pic xmlns:pic="http://schemas.openxmlformats.org/drawingml/2006/picture">
                   <pic:nvPicPr>
-                    <pic:cNvPr id="949030391" name=""/>
+                    <pic:cNvPr id="949030391" name="Picture 1"/>
                     <pic:cNvPicPr/>
                   </pic:nvPicPr>
                   <pic:blipFill>
@@ -1852,7 +1873,7 @@
                   <pic:spPr>
                     <a:xfrm>
                       <a:off x="0" y="0"/>
-                      <a:ext cx="6858000" cy="3842385"/>
+                      <a:ext cx="6858000" cy="2632193"/>
                     </a:xfrm>
                     <a:prstGeom prst="rect">
                       <a:avLst/>
@@ -1873,6 +1894,7 @@
       <w:r>
         <w:rPr>
           <w:i/>
+          <w:noProof/>
         </w:rPr>
         <w:drawing>
           <wp:inline distT="0" distB="0" distL="0" distR="0" wp14:anchorId="3C76A088" wp14:editId="27F28ED6">
@@ -1920,6 +1942,7 @@
       <w:r>
         <w:rPr>
           <w:i/>
+          <w:noProof/>
         </w:rPr>
         <w:lastRenderedPageBreak/>
         <w:drawing>
@@ -1968,6 +1991,7 @@
       <w:r>
         <w:rPr>
           <w:i/>
+          <w:noProof/>
         </w:rPr>
         <w:drawing>
           <wp:inline distT="0" distB="0" distL="0" distR="0" wp14:anchorId="60769C5F" wp14:editId="3A3A7EEE">
@@ -2015,6 +2039,7 @@
       <w:r>
         <w:rPr>
           <w:i/>
+          <w:noProof/>
         </w:rPr>
         <w:drawing>
           <wp:inline distT="0" distB="0" distL="0" distR="0" wp14:anchorId="098EEAA8" wp14:editId="560C3C4C">
@@ -2062,6 +2087,7 @@
       <w:r>
         <w:rPr>
           <w:i/>
+          <w:noProof/>
         </w:rPr>
         <w:lastRenderedPageBreak/>
         <w:drawing>
@@ -2211,6 +2237,9 @@
         </w:pBdr>
       </w:pPr>
       <w:r>
+        <w:rPr>
+          <w:noProof/>
+        </w:rPr>
         <w:lastRenderedPageBreak/>
         <w:drawing>
           <wp:inline distT="0" distB="0" distL="0" distR="0" wp14:anchorId="779929EC" wp14:editId="754CFD8A">
@@ -2256,6 +2285,9 @@
         </w:pBdr>
       </w:pPr>
       <w:r>
+        <w:rPr>
+          <w:noProof/>
+        </w:rPr>
         <w:lastRenderedPageBreak/>
         <w:drawing>
           <wp:inline distT="0" distB="0" distL="0" distR="0" wp14:anchorId="1F07DE69" wp14:editId="2D03F73A">
@@ -2301,6 +2333,9 @@
         </w:pBdr>
       </w:pPr>
       <w:r>
+        <w:rPr>
+          <w:noProof/>
+        </w:rPr>
         <w:lastRenderedPageBreak/>
         <w:drawing>
           <wp:inline distT="0" distB="0" distL="0" distR="0" wp14:anchorId="0933E125" wp14:editId="58B7BEE5">
@@ -2346,6 +2381,9 @@
         </w:pBdr>
       </w:pPr>
       <w:r>
+        <w:rPr>
+          <w:noProof/>
+        </w:rPr>
         <w:drawing>
           <wp:inline distT="0" distB="0" distL="0" distR="0" wp14:anchorId="34890472" wp14:editId="3D8B6993">
             <wp:extent cx="6858000" cy="3973830"/>
@@ -2390,6 +2428,9 @@
         </w:pBdr>
       </w:pPr>
       <w:r>
+        <w:rPr>
+          <w:noProof/>
+        </w:rPr>
         <w:lastRenderedPageBreak/>
         <w:drawing>
           <wp:inline distT="0" distB="0" distL="0" distR="0" wp14:anchorId="67E98379" wp14:editId="66F5DFBE">

</xml_diff>